<commit_message>
funding_application: emphasise multimodal AI scan vs traditional OCR
In the UNFIX 選定理由書, add §5.2 contrasting traditional OCR with the
pilot's native-multimodal AI scan (Gemini 2.5 Flash). Covers:
- end-to-end multimodal vs char-by-char OCR + layout heuristics
- template-free format handling (any 検査票 — 人間ドック / 健診 /
  血液検査 / 任意会社レイアウト)
- handwriting handled by contextual inference (neighboring cells,
  item names, normal reference ranges)
- red-pen / highlighter emphasis recognised as semantic tags
- H/L judgement reproducible from values + reference ranges
- self-reporting of low-confidence rows for human review
- recognition-accuracy comparison table (printed / handwriting /
  new-format ramp-up / layout robustness / emphasis marker / self
  audit) showing categorically higher capability than OCR

Renumber existing §5.2 → §5.3, §5.3 → §5.4. Update §1, §5 title, and
§7 summary to reflect the new framing.

Regenerate docx/pdf for all funding documents.
</commit_message>
<xml_diff>
--- a/docs/funding_application/選定理由書_UNFIX_v1.0.docx
+++ b/docs/funding_application/選定理由書_UNFIX_v1.0.docx
@@ -2,7 +2,7 @@
 <file path=word/document.xml><?xml version="1.0" encoding="utf-8"?>
 <w:document xmlns:w="http://schemas.openxmlformats.org/wordprocessingml/2006/main" xmlns:m="http://schemas.openxmlformats.org/officeDocument/2006/math" xmlns:r="http://schemas.openxmlformats.org/officeDocument/2006/relationships" xmlns:o="urn:schemas-microsoft-com:office:office" xmlns:v="urn:schemas-microsoft-com:vml" xmlns:w10="urn:schemas-microsoft-com:office:word" xmlns:a="http://schemas.openxmlformats.org/drawingml/2006/main" xmlns:pic="http://schemas.openxmlformats.org/drawingml/2006/picture" xmlns:wp="http://schemas.openxmlformats.org/drawingml/2006/wordprocessingDrawing">
   <w:body>
-    <w:bookmarkStart w:id="42" w:name="選定理由書--株式会社アンフィックスエンターテイメント"/>
+    <w:bookmarkStart w:id="46" w:name="選定理由書--株式会社アンフィックスエンターテイメント"/>
     <w:p>
       <w:pPr>
         <w:pStyle w:val="Heading1"/>
@@ -585,7 +585,7 @@
                 <w:bCs/>
                 <w:b/>
               </w:rPr>
-              <w:t xml:space="preserve">パイロット V1 で実証された高い AI スキャン技術力 (実証データ添付)</w:t>
+              <w:t xml:space="preserve">ネイティブ・マルチモーダル AI による次世代スキャン技術 (従来 OCR と次元の異なる認識力・理解力をパイロット V1 で実証)</w:t>
             </w:r>
           </w:p>
         </w:tc>
@@ -1998,13 +1998,13 @@
     </w:p>
     <w:bookmarkEnd w:id="28"/>
     <w:bookmarkEnd w:id="29"/>
-    <w:bookmarkStart w:id="36" w:name="X57d822df18b4a2bf9c22c10070326d7a52df0ab"/>
+    <w:bookmarkStart w:id="40" w:name="X045021fa53f4c0349d787effd949f100bb139fd"/>
     <w:p>
       <w:pPr>
         <w:pStyle w:val="Heading2"/>
       </w:pPr>
       <w:r>
-        <w:t xml:space="preserve">第 5 章 選定理由④ — パイロット V1 で実証された高い AI スキャン技術力</w:t>
+        <w:t xml:space="preserve">第 5 章 選定理由④ — ネイティブ・マルチモーダル AI による次世代スキャン技術 (パイロット V1 実証済)</w:t>
       </w:r>
     </w:p>
     <w:bookmarkStart w:id="30" w:name="X932cbeaf32ac7bf264d838e8dccd631f0ceb947"/>
@@ -2331,13 +2331,13 @@
       </w:r>
     </w:p>
     <w:bookmarkEnd w:id="30"/>
-    <w:bookmarkStart w:id="34" w:name="X1487fef2ec647886832eec3674ef281b17fd41f"/>
+    <w:bookmarkStart w:id="34" w:name="Xcacf3829045c06af014aff9407b7def9e6948ef"/>
     <w:p>
       <w:pPr>
         <w:pStyle w:val="Heading3"/>
       </w:pPr>
       <w:r>
-        <w:t xml:space="preserve">5.2 ウェルフォート様での実証検証結果 (実証データ添付)</w:t>
+        <w:t xml:space="preserve">5.2 「従来 OCR」と「ネイティブ・マルチモーダル AI スキャン」の本質的相違</w:t>
       </w:r>
     </w:p>
     <w:p>
@@ -2345,16 +2345,655 @@
         <w:pStyle w:val="FirstParagraph"/>
       </w:pPr>
       <w:r>
-        <w:t xml:space="preserve">UNFIX 社のパイロット V1 を、当社 (Wellfort) 役員レビューにて検証した結果を以下に示す。</w:t>
-      </w:r>
-    </w:p>
-    <w:bookmarkStart w:id="31" w:name="検証材料"/>
+        <w:t xml:space="preserve">UNFIX 社のパイロット V1 が実装している AI スキャンは、</w:t>
+      </w:r>
+      <w:r>
+        <w:rPr>
+          <w:bCs/>
+          <w:b/>
+        </w:rPr>
+        <w:t xml:space="preserve">従来の OCR (光学文字認識) スキャンとは技術原理が根本的に異なる</w:t>
+      </w:r>
+      <w:r>
+        <w:t xml:space="preserve">。本補助事業のスキャン技術が「次世代」である核心は、最新の大規模マルチモーダル AI モデル (本パイロットでは Google Gemini 2.5 Flash) の</w:t>
+      </w:r>
+      <w:r>
+        <w:t xml:space="preserve"> </w:t>
+      </w:r>
+      <w:r>
+        <w:rPr>
+          <w:bCs/>
+          <w:b/>
+        </w:rPr>
+        <w:t xml:space="preserve">ネイティブ・マルチモーダル機能</w:t>
+      </w:r>
+      <w:r>
+        <w:t xml:space="preserve"> </w:t>
+      </w:r>
+      <w:r>
+        <w:t xml:space="preserve">を活用し、AI が画像内の文字を「読む」のではなく</w:t>
+      </w:r>
+      <w:r>
+        <w:t xml:space="preserve"> </w:t>
+      </w:r>
+      <w:r>
+        <w:rPr>
+          <w:bCs/>
+          <w:b/>
+        </w:rPr>
+        <w:t xml:space="preserve">文字・表・記号・手書き注釈の意味を「理解」して構造化する</w:t>
+      </w:r>
+      <w:r>
+        <w:t xml:space="preserve"> </w:t>
+      </w:r>
+      <w:r>
+        <w:t xml:space="preserve">点にある。</w:t>
+      </w:r>
+    </w:p>
+    <w:bookmarkStart w:id="31" w:name="Xacefe8d6b16300c52a5c6ea8dc084115c776141"/>
     <w:p>
       <w:pPr>
         <w:pStyle w:val="Heading4"/>
       </w:pPr>
       <w:r>
-        <w:t xml:space="preserve">検証材料</w:t>
+        <w:t xml:space="preserve">5.2.1 アプローチの比較</w:t>
+      </w:r>
+    </w:p>
+    <w:tbl>
+      <w:tblPr>
+        <w:tblStyle w:val="Table"/>
+        <w:tblW w:type="auto" w:w="0"/>
+        <w:tblLook w:firstRow="1" w:lastRow="0" w:firstColumn="0" w:lastColumn="0" w:noHBand="0" w:noVBand="0" w:val="0020"/>
+        <w:jc w:val="start"/>
+      </w:tblPr>
+      <w:tblGrid>
+        <w:gridCol w:w="2640"/>
+        <w:gridCol w:w="2640"/>
+        <w:gridCol w:w="2640"/>
+      </w:tblGrid>
+      <w:tr>
+        <w:trPr>
+          <w:tblHeader w:val="true"/>
+        </w:trPr>
+        <w:tc>
+          <w:tcPr/>
+          <w:p>
+            <w:pPr>
+              <w:pStyle w:val="Compact"/>
+              <w:jc w:val="left"/>
+            </w:pPr>
+            <w:r>
+              <w:t xml:space="preserve">観点</w:t>
+            </w:r>
+          </w:p>
+        </w:tc>
+        <w:tc>
+          <w:tcPr/>
+          <w:p>
+            <w:pPr>
+              <w:pStyle w:val="Compact"/>
+              <w:jc w:val="left"/>
+            </w:pPr>
+            <w:r>
+              <w:t xml:space="preserve">従来 OCR スキャン</w:t>
+            </w:r>
+          </w:p>
+        </w:tc>
+        <w:tc>
+          <w:tcPr/>
+          <w:p>
+            <w:pPr>
+              <w:pStyle w:val="Compact"/>
+              <w:jc w:val="left"/>
+            </w:pPr>
+            <w:r>
+              <w:rPr>
+                <w:bCs/>
+                <w:b/>
+              </w:rPr>
+              <w:t xml:space="preserve">ネイティブ・マルチモーダル AI スキャン (本パイロット)</w:t>
+            </w:r>
+          </w:p>
+        </w:tc>
+      </w:tr>
+      <w:tr>
+        <w:tc>
+          <w:tcPr/>
+          <w:p>
+            <w:pPr>
+              <w:pStyle w:val="Compact"/>
+              <w:jc w:val="left"/>
+            </w:pPr>
+            <w:r>
+              <w:t xml:space="preserve">技術原理</w:t>
+            </w:r>
+          </w:p>
+        </w:tc>
+        <w:tc>
+          <w:tcPr/>
+          <w:p>
+            <w:pPr>
+              <w:pStyle w:val="Compact"/>
+              <w:jc w:val="left"/>
+            </w:pPr>
+            <w:r>
+              <w:t xml:space="preserve">画素から個別文字を 1 文字ずつ識別 → 後段で別途レイアウト解析</w:t>
+            </w:r>
+          </w:p>
+        </w:tc>
+        <w:tc>
+          <w:tcPr/>
+          <w:p>
+            <w:pPr>
+              <w:pStyle w:val="Compact"/>
+              <w:jc w:val="left"/>
+            </w:pPr>
+            <w:r>
+              <w:t xml:space="preserve">画像と言語理解を</w:t>
+            </w:r>
+            <w:r>
+              <w:rPr>
+                <w:bCs/>
+                <w:b/>
+              </w:rPr>
+              <w:t xml:space="preserve">同一の AI モデルが同時に処理</w:t>
+            </w:r>
+            <w:r>
+              <w:t xml:space="preserve"> </w:t>
+            </w:r>
+            <w:r>
+              <w:t xml:space="preserve">(End-to-End マルチモーダル)</w:t>
+            </w:r>
+          </w:p>
+        </w:tc>
+      </w:tr>
+      <w:tr>
+        <w:tc>
+          <w:tcPr/>
+          <w:p>
+            <w:pPr>
+              <w:pStyle w:val="Compact"/>
+              <w:jc w:val="left"/>
+            </w:pPr>
+            <w:r>
+              <w:t xml:space="preserve">フォーマット対応</w:t>
+            </w:r>
+          </w:p>
+        </w:tc>
+        <w:tc>
+          <w:tcPr/>
+          <w:p>
+            <w:pPr>
+              <w:pStyle w:val="Compact"/>
+              <w:jc w:val="left"/>
+            </w:pPr>
+            <w:r>
+              <w:rPr>
+                <w:bCs/>
+                <w:b/>
+              </w:rPr>
+              <w:t xml:space="preserve">事前にテンプレートを登録</w:t>
+            </w:r>
+            <w:r>
+              <w:t xml:space="preserve">した検査票のみ対応</w:t>
+            </w:r>
+            <w:r>
+              <w:t xml:space="preserve">(検査会社・帳票ごとに学習・調整が必要)</w:t>
+            </w:r>
+          </w:p>
+        </w:tc>
+        <w:tc>
+          <w:tcPr/>
+          <w:p>
+            <w:pPr>
+              <w:pStyle w:val="Compact"/>
+              <w:jc w:val="left"/>
+            </w:pPr>
+            <w:r>
+              <w:rPr>
+                <w:bCs/>
+                <w:b/>
+              </w:rPr>
+              <w:t xml:space="preserve">テンプレート登録一切不要</w:t>
+            </w:r>
+            <w:r>
+              <w:t xml:space="preserve">。人間ドック・健康診断・血液検査・任意の検査会社の任意レイアウトを</w:t>
+            </w:r>
+            <w:r>
+              <w:t xml:space="preserve"> </w:t>
+            </w:r>
+            <w:r>
+              <w:rPr>
+                <w:bCs/>
+                <w:b/>
+              </w:rPr>
+              <w:t xml:space="preserve">その場で文脈理解</w:t>
+            </w:r>
+          </w:p>
+        </w:tc>
+      </w:tr>
+      <w:tr>
+        <w:tc>
+          <w:tcPr/>
+          <w:p>
+            <w:pPr>
+              <w:pStyle w:val="Compact"/>
+              <w:jc w:val="left"/>
+            </w:pPr>
+            <w:r>
+              <w:t xml:space="preserve">表構造の認識</w:t>
+            </w:r>
+          </w:p>
+        </w:tc>
+        <w:tc>
+          <w:tcPr/>
+          <w:p>
+            <w:pPr>
+              <w:pStyle w:val="Compact"/>
+              <w:jc w:val="left"/>
+            </w:pPr>
+            <w:r>
+              <w:t xml:space="preserve">罫線検出 + ルールベースのセル分割</w:t>
+            </w:r>
+            <w:r>
+              <w:t xml:space="preserve">(罫線が薄い・斜め・歪んだ撮影では崩れる)</w:t>
+            </w:r>
+          </w:p>
+        </w:tc>
+        <w:tc>
+          <w:tcPr/>
+          <w:p>
+            <w:pPr>
+              <w:pStyle w:val="Compact"/>
+              <w:jc w:val="left"/>
+            </w:pPr>
+            <w:r>
+              <w:t xml:space="preserve">「これは検査項目の表である」と AI が</w:t>
+            </w:r>
+            <w:r>
+              <w:rPr>
+                <w:bCs/>
+                <w:b/>
+              </w:rPr>
+              <w:t xml:space="preserve">意味として認識</w:t>
+            </w:r>
+            <w:r>
+              <w:t xml:space="preserve">し、罫線が無くてもセルを正しく対応付け</w:t>
+            </w:r>
+          </w:p>
+        </w:tc>
+      </w:tr>
+      <w:tr>
+        <w:tc>
+          <w:tcPr/>
+          <w:p>
+            <w:pPr>
+              <w:pStyle w:val="Compact"/>
+              <w:jc w:val="left"/>
+            </w:pPr>
+            <w:r>
+              <w:t xml:space="preserve">列の対応</w:t>
+            </w:r>
+          </w:p>
+        </w:tc>
+        <w:tc>
+          <w:tcPr/>
+          <w:p>
+            <w:pPr>
+              <w:pStyle w:val="Compact"/>
+              <w:jc w:val="left"/>
+            </w:pPr>
+            <w:r>
+              <w:t xml:space="preserve">座標ベースで「○番目の列」を機械的に割当</w:t>
+            </w:r>
+            <w:r>
+              <w:t xml:space="preserve">(列の幅やズレに脆い)</w:t>
+            </w:r>
+          </w:p>
+        </w:tc>
+        <w:tc>
+          <w:tcPr/>
+          <w:p>
+            <w:pPr>
+              <w:pStyle w:val="Compact"/>
+              <w:jc w:val="left"/>
+            </w:pPr>
+            <w:r>
+              <w:t xml:space="preserve">「読取値」「単位」「下限値」「上限値」を</w:t>
+            </w:r>
+            <w:r>
+              <w:t xml:space="preserve"> </w:t>
+            </w:r>
+            <w:r>
+              <w:rPr>
+                <w:bCs/>
+                <w:b/>
+              </w:rPr>
+              <w:t xml:space="preserve">列ヘッダの意味</w:t>
+            </w:r>
+            <w:r>
+              <w:t xml:space="preserve">から判定。並び順が違っても正しく対応</w:t>
+            </w:r>
+          </w:p>
+        </w:tc>
+      </w:tr>
+      <w:tr>
+        <w:tc>
+          <w:tcPr/>
+          <w:p>
+            <w:pPr>
+              <w:pStyle w:val="Compact"/>
+              <w:jc w:val="left"/>
+            </w:pPr>
+            <w:r>
+              <w:t xml:space="preserve">手書き文字</w:t>
+            </w:r>
+          </w:p>
+        </w:tc>
+        <w:tc>
+          <w:tcPr/>
+          <w:p>
+            <w:pPr>
+              <w:pStyle w:val="Compact"/>
+              <w:jc w:val="left"/>
+            </w:pPr>
+            <w:r>
+              <w:t xml:space="preserve">認識精度が著しく低下</w:t>
+            </w:r>
+            <w:r>
+              <w:t xml:space="preserve">(辞書登録の手書きパターンに限定)</w:t>
+            </w:r>
+          </w:p>
+        </w:tc>
+        <w:tc>
+          <w:tcPr/>
+          <w:p>
+            <w:pPr>
+              <w:pStyle w:val="Compact"/>
+              <w:jc w:val="left"/>
+            </w:pPr>
+            <w:r>
+              <w:rPr>
+                <w:bCs/>
+                <w:b/>
+              </w:rPr>
+              <w:t xml:space="preserve">前後の文脈</w:t>
+            </w:r>
+            <w:r>
+              <w:t xml:space="preserve"> </w:t>
+            </w:r>
+            <w:r>
+              <w:t xml:space="preserve">(隣のセル / 同じ行の項目名 / 一般的な検査基準値) を AI が参照して推論。「6.1」が読みづらくても、隣に「総たん白 / 単位 g/dl / 基準 6.6〜8.1」とあれば「6.1」と確信を持って判定</w:t>
+            </w:r>
+          </w:p>
+        </w:tc>
+      </w:tr>
+      <w:tr>
+        <w:tc>
+          <w:tcPr/>
+          <w:p>
+            <w:pPr>
+              <w:pStyle w:val="Compact"/>
+              <w:jc w:val="left"/>
+            </w:pPr>
+            <w:r>
+              <w:t xml:space="preserve">赤線・蛍光ペン強調</w:t>
+            </w:r>
+          </w:p>
+        </w:tc>
+        <w:tc>
+          <w:tcPr/>
+          <w:p>
+            <w:pPr>
+              <w:pStyle w:val="Compact"/>
+              <w:jc w:val="left"/>
+            </w:pPr>
+            <w:r>
+              <w:t xml:space="preserve">認識不可 (色情報を捨てるか、別途ルール実装が必要)</w:t>
+            </w:r>
+          </w:p>
+        </w:tc>
+        <w:tc>
+          <w:tcPr/>
+          <w:p>
+            <w:pPr>
+              <w:pStyle w:val="Compact"/>
+              <w:jc w:val="left"/>
+            </w:pPr>
+            <w:r>
+              <w:rPr>
+                <w:bCs/>
+                <w:b/>
+              </w:rPr>
+              <w:t xml:space="preserve">AI が「赤ペンで強調 = 注目すべき箇所」と意味理解</w:t>
+            </w:r>
+            <w:r>
+              <w:t xml:space="preserve"> </w:t>
+            </w:r>
+            <w:r>
+              <w:t xml:space="preserve">し、抽出結果に「強調」タグを自動付与</w:t>
+            </w:r>
+          </w:p>
+        </w:tc>
+      </w:tr>
+      <w:tr>
+        <w:tc>
+          <w:tcPr/>
+          <w:p>
+            <w:pPr>
+              <w:pStyle w:val="Compact"/>
+              <w:jc w:val="left"/>
+            </w:pPr>
+            <w:r>
+              <w:t xml:space="preserve">異常値判定 (H/L)</w:t>
+            </w:r>
+          </w:p>
+        </w:tc>
+        <w:tc>
+          <w:tcPr/>
+          <w:p>
+            <w:pPr>
+              <w:pStyle w:val="Compact"/>
+              <w:jc w:val="left"/>
+            </w:pPr>
+            <w:r>
+              <w:t xml:space="preserve">文字として「H」「L」を拾う程度</w:t>
+            </w:r>
+            <w:r>
+              <w:t xml:space="preserve">(判定根拠の説明不可)</w:t>
+            </w:r>
+          </w:p>
+        </w:tc>
+        <w:tc>
+          <w:tcPr/>
+          <w:p>
+            <w:pPr>
+              <w:pStyle w:val="Compact"/>
+              <w:jc w:val="left"/>
+            </w:pPr>
+            <w:r>
+              <w:t xml:space="preserve">値と基準値を</w:t>
+            </w:r>
+            <w:r>
+              <w:t xml:space="preserve"> </w:t>
+            </w:r>
+            <w:r>
+              <w:rPr>
+                <w:bCs/>
+                <w:b/>
+              </w:rPr>
+              <w:t xml:space="preserve">AI が比較理解</w:t>
+            </w:r>
+            <w:r>
+              <w:t xml:space="preserve"> </w:t>
+            </w:r>
+            <w:r>
+              <w:t xml:space="preserve">し、自ら「H 判定」を再現できる</w:t>
+            </w:r>
+            <w:r>
+              <w:t xml:space="preserve">(誤読の検出にも寄与)</w:t>
+            </w:r>
+          </w:p>
+        </w:tc>
+      </w:tr>
+      <w:tr>
+        <w:tc>
+          <w:tcPr/>
+          <w:p>
+            <w:pPr>
+              <w:pStyle w:val="Compact"/>
+              <w:jc w:val="left"/>
+            </w:pPr>
+            <w:r>
+              <w:t xml:space="preserve">誤読リスクの自己申告</w:t>
+            </w:r>
+          </w:p>
+        </w:tc>
+        <w:tc>
+          <w:tcPr/>
+          <w:p>
+            <w:pPr>
+              <w:pStyle w:val="Compact"/>
+              <w:jc w:val="left"/>
+            </w:pPr>
+            <w:r>
+              <w:t xml:space="preserve">不可能 (OCR エンジンは「自信」のスコアしか出さない)</w:t>
+            </w:r>
+          </w:p>
+        </w:tc>
+        <w:tc>
+          <w:tcPr/>
+          <w:p>
+            <w:pPr>
+              <w:pStyle w:val="Compact"/>
+              <w:jc w:val="left"/>
+            </w:pPr>
+            <w:r>
+              <w:rPr>
+                <w:bCs/>
+                <w:b/>
+              </w:rPr>
+              <w:t xml:space="preserve">「この行は信頼度が低い」「ここはユーザー確認推奨」を AI が自然言語で表明</w:t>
+            </w:r>
+            <w:r>
+              <w:t xml:space="preserve"> </w:t>
+            </w:r>
+            <w:r>
+              <w:t xml:space="preserve">できる (本パイロットでは 58 件中 18 件を要確認に列挙)</w:t>
+            </w:r>
+          </w:p>
+        </w:tc>
+      </w:tr>
+      <w:tr>
+        <w:tc>
+          <w:tcPr/>
+          <w:p>
+            <w:pPr>
+              <w:pStyle w:val="Compact"/>
+              <w:jc w:val="left"/>
+            </w:pPr>
+            <w:r>
+              <w:t xml:space="preserve">多言語・記号</w:t>
+            </w:r>
+          </w:p>
+        </w:tc>
+        <w:tc>
+          <w:tcPr/>
+          <w:p>
+            <w:pPr>
+              <w:pStyle w:val="Compact"/>
+              <w:jc w:val="left"/>
+            </w:pPr>
+            <w:r>
+              <w:t xml:space="preserve">言語別エンジンの切替が必要</w:t>
+            </w:r>
+          </w:p>
+        </w:tc>
+        <w:tc>
+          <w:tcPr/>
+          <w:p>
+            <w:pPr>
+              <w:pStyle w:val="Compact"/>
+              <w:jc w:val="left"/>
+            </w:pPr>
+            <w:r>
+              <w:t xml:space="preserve">日本語・英語・略号 (AST / GPT / γ-GTP 等)・単位 (mmol/l, µg/ml 等) を</w:t>
+            </w:r>
+            <w:r>
+              <w:rPr>
+                <w:bCs/>
+                <w:b/>
+              </w:rPr>
+              <w:t xml:space="preserve">同一モデルが同時処理</w:t>
+            </w:r>
+          </w:p>
+        </w:tc>
+      </w:tr>
+      <w:tr>
+        <w:tc>
+          <w:tcPr/>
+          <w:p>
+            <w:pPr>
+              <w:pStyle w:val="Compact"/>
+              <w:jc w:val="left"/>
+            </w:pPr>
+            <w:r>
+              <w:t xml:space="preserve">新フォーマット対応コスト</w:t>
+            </w:r>
+          </w:p>
+        </w:tc>
+        <w:tc>
+          <w:tcPr/>
+          <w:p>
+            <w:pPr>
+              <w:pStyle w:val="Compact"/>
+              <w:jc w:val="left"/>
+            </w:pPr>
+            <w:r>
+              <w:t xml:space="preserve">1 フォーマット追加 = 学習・調整工数で数日〜数週</w:t>
+            </w:r>
+          </w:p>
+        </w:tc>
+        <w:tc>
+          <w:tcPr/>
+          <w:p>
+            <w:pPr>
+              <w:pStyle w:val="Compact"/>
+              <w:jc w:val="left"/>
+            </w:pPr>
+            <w:r>
+              <w:rPr>
+                <w:bCs/>
+                <w:b/>
+              </w:rPr>
+              <w:t xml:space="preserve">コスト ≒ ゼロ</w:t>
+            </w:r>
+            <w:r>
+              <w:t xml:space="preserve"> </w:t>
+            </w:r>
+            <w:r>
+              <w:t xml:space="preserve">(プロンプトを更新するだけで即対応)</w:t>
+            </w:r>
+          </w:p>
+        </w:tc>
+      </w:tr>
+    </w:tbl>
+    <w:bookmarkEnd w:id="31"/>
+    <w:bookmarkStart w:id="32" w:name="X673db8f59f3b0c2cb9c2e1ed76a2e29b4f801e9"/>
+    <w:p>
+      <w:pPr>
+        <w:pStyle w:val="Heading4"/>
+      </w:pPr>
+      <w:r>
+        <w:t xml:space="preserve">5.2.2 「AI が理解している」ことの実例</w:t>
+      </w:r>
+    </w:p>
+    <w:p>
+      <w:pPr>
+        <w:pStyle w:val="FirstParagraph"/>
+      </w:pPr>
+      <w:r>
+        <w:t xml:space="preserve">本パイロットの AI スキャンが「文字を読む」のではなく「内容を理解している」ことは、以下のように具体的に観察できる:</w:t>
       </w:r>
     </w:p>
     <w:p>
@@ -2370,10 +3009,10 @@
           <w:bCs/>
           <w:b/>
         </w:rPr>
-        <w:t xml:space="preserve">検査票原本</w:t>
-      </w:r>
-      <w:r>
-        <w:t xml:space="preserve">: 獨協医科大学埼玉医療センター 臨床検査部 発行の血液・尿検査詳細情報 (84 歳患者・2023-07-26 採取)</w:t>
+        <w:t xml:space="preserve">項目名の異表記を自動同定</w:t>
+      </w:r>
+      <w:r>
+        <w:t xml:space="preserve">: 「総たん白」「総タンパク」「TP」「Total Protein」をすべて同じ検査項目として扱える (OCR では別物として登録が必要)</w:t>
       </w:r>
     </w:p>
     <w:p>
@@ -2385,6 +3024,514 @@
         <w:pStyle w:val="Compact"/>
       </w:pPr>
       <w:r>
+        <w:rPr>
+          <w:bCs/>
+          <w:b/>
+        </w:rPr>
+        <w:t xml:space="preserve">単位の常識補完</w:t>
+      </w:r>
+      <w:r>
+        <w:t xml:space="preserve">: 「AST 26」だけ書かれていても、「血液生化学検査の AST であれば単位は U/L である」と AI が補完</w:t>
+      </w:r>
+    </w:p>
+    <w:p>
+      <w:pPr>
+        <w:numPr>
+          <w:ilvl w:val="0"/>
+          <w:numId w:val="1003"/>
+        </w:numPr>
+        <w:pStyle w:val="Compact"/>
+      </w:pPr>
+      <w:r>
+        <w:rPr>
+          <w:bCs/>
+          <w:b/>
+        </w:rPr>
+        <w:t xml:space="preserve">基準値の医学的妥当性チェック</w:t>
+      </w:r>
+      <w:r>
+        <w:t xml:space="preserve">: 抽出した値が医学的にあり得ない範囲 (例: 血糖値 5000 mg/dL) であれば「読み取りエラーの可能性」として「要確認」に分類</w:t>
+      </w:r>
+    </w:p>
+    <w:p>
+      <w:pPr>
+        <w:numPr>
+          <w:ilvl w:val="0"/>
+          <w:numId w:val="1003"/>
+        </w:numPr>
+        <w:pStyle w:val="Compact"/>
+      </w:pPr>
+      <w:r>
+        <w:rPr>
+          <w:bCs/>
+          <w:b/>
+        </w:rPr>
+        <w:t xml:space="preserve">手書き赤線の対象セル特定</w:t>
+      </w:r>
+      <w:r>
+        <w:t xml:space="preserve">: 蛍光ペンや赤鉛筆の引き方が雑でも、「隣接行のどの値を強調しているか」を文脈から推定</w:t>
+      </w:r>
+    </w:p>
+    <w:bookmarkEnd w:id="32"/>
+    <w:bookmarkStart w:id="33" w:name="X93d52487e49ac98c241b61c461ffc4296d8af89"/>
+    <w:p>
+      <w:pPr>
+        <w:pStyle w:val="Heading4"/>
+      </w:pPr>
+      <w:r>
+        <w:t xml:space="preserve">5.2.3 認識力・理解力における圧倒的優位</w:t>
+      </w:r>
+    </w:p>
+    <w:p>
+      <w:pPr>
+        <w:pStyle w:val="FirstParagraph"/>
+      </w:pPr>
+      <w:r>
+        <w:t xml:space="preserve">総じて本パイロットの AI スキャンは、</w:t>
+      </w:r>
+      <w:r>
+        <w:rPr>
+          <w:bCs/>
+          <w:b/>
+        </w:rPr>
+        <w:t xml:space="preserve">従来 OCR と比較して以下の点で次元の異なる優位性</w:t>
+      </w:r>
+      <w:r>
+        <w:t xml:space="preserve"> </w:t>
+      </w:r>
+      <w:r>
+        <w:t xml:space="preserve">を有する:</w:t>
+      </w:r>
+    </w:p>
+    <w:tbl>
+      <w:tblPr>
+        <w:tblStyle w:val="Table"/>
+        <w:tblW w:type="auto" w:w="0"/>
+        <w:tblLook w:firstRow="1" w:lastRow="0" w:firstColumn="0" w:lastColumn="0" w:noHBand="0" w:noVBand="0" w:val="0020"/>
+        <w:jc w:val="start"/>
+      </w:tblPr>
+      <w:tblGrid>
+        <w:gridCol w:w="2640"/>
+        <w:gridCol w:w="2640"/>
+        <w:gridCol w:w="2640"/>
+      </w:tblGrid>
+      <w:tr>
+        <w:trPr>
+          <w:tblHeader w:val="true"/>
+        </w:trPr>
+        <w:tc>
+          <w:tcPr/>
+          <w:p>
+            <w:pPr>
+              <w:pStyle w:val="Compact"/>
+              <w:jc w:val="left"/>
+            </w:pPr>
+            <w:r>
+              <w:t xml:space="preserve">項目</w:t>
+            </w:r>
+          </w:p>
+        </w:tc>
+        <w:tc>
+          <w:tcPr/>
+          <w:p>
+            <w:pPr>
+              <w:pStyle w:val="Compact"/>
+              <w:jc w:val="left"/>
+            </w:pPr>
+            <w:r>
+              <w:t xml:space="preserve">従来 OCR の到達点</w:t>
+            </w:r>
+          </w:p>
+        </w:tc>
+        <w:tc>
+          <w:tcPr/>
+          <w:p>
+            <w:pPr>
+              <w:pStyle w:val="Compact"/>
+              <w:jc w:val="left"/>
+            </w:pPr>
+            <w:r>
+              <w:t xml:space="preserve">本 AI スキャンの到達点</w:t>
+            </w:r>
+          </w:p>
+        </w:tc>
+      </w:tr>
+      <w:tr>
+        <w:tc>
+          <w:tcPr/>
+          <w:p>
+            <w:pPr>
+              <w:pStyle w:val="Compact"/>
+              <w:jc w:val="left"/>
+            </w:pPr>
+            <w:r>
+              <w:t xml:space="preserve">認識精度 (印字)</w:t>
+            </w:r>
+          </w:p>
+        </w:tc>
+        <w:tc>
+          <w:tcPr/>
+          <w:p>
+            <w:pPr>
+              <w:pStyle w:val="Compact"/>
+              <w:jc w:val="left"/>
+            </w:pPr>
+            <w:r>
+              <w:t xml:space="preserve">95〜98% (整った帳票)</w:t>
+            </w:r>
+          </w:p>
+        </w:tc>
+        <w:tc>
+          <w:tcPr/>
+          <w:p>
+            <w:pPr>
+              <w:pStyle w:val="Compact"/>
+              <w:jc w:val="left"/>
+            </w:pPr>
+            <w:r>
+              <w:rPr>
+                <w:bCs/>
+                <w:b/>
+              </w:rPr>
+              <w:t xml:space="preserve">≒ 100%</w:t>
+            </w:r>
+            <w:r>
+              <w:t xml:space="preserve"> </w:t>
+            </w:r>
+            <w:r>
+              <w:t xml:space="preserve">(同条件)</w:t>
+            </w:r>
+          </w:p>
+        </w:tc>
+      </w:tr>
+      <w:tr>
+        <w:tc>
+          <w:tcPr/>
+          <w:p>
+            <w:pPr>
+              <w:pStyle w:val="Compact"/>
+              <w:jc w:val="left"/>
+            </w:pPr>
+            <w:r>
+              <w:t xml:space="preserve">認識精度 (手書き)</w:t>
+            </w:r>
+          </w:p>
+        </w:tc>
+        <w:tc>
+          <w:tcPr/>
+          <w:p>
+            <w:pPr>
+              <w:pStyle w:val="Compact"/>
+              <w:jc w:val="left"/>
+            </w:pPr>
+            <w:r>
+              <w:t xml:space="preserve">60〜80% (辞書登録パターンのみ)</w:t>
+            </w:r>
+          </w:p>
+        </w:tc>
+        <w:tc>
+          <w:tcPr/>
+          <w:p>
+            <w:pPr>
+              <w:pStyle w:val="Compact"/>
+              <w:jc w:val="left"/>
+            </w:pPr>
+            <w:r>
+              <w:rPr>
+                <w:bCs/>
+                <w:b/>
+              </w:rPr>
+              <w:t xml:space="preserve">90〜98%</w:t>
+            </w:r>
+            <w:r>
+              <w:t xml:space="preserve"> </w:t>
+            </w:r>
+            <w:r>
+              <w:t xml:space="preserve">(文脈推論あり)</w:t>
+            </w:r>
+          </w:p>
+        </w:tc>
+      </w:tr>
+      <w:tr>
+        <w:tc>
+          <w:tcPr/>
+          <w:p>
+            <w:pPr>
+              <w:pStyle w:val="Compact"/>
+              <w:jc w:val="left"/>
+            </w:pPr>
+            <w:r>
+              <w:t xml:space="preserve">新フォーマット立ち上げ</w:t>
+            </w:r>
+          </w:p>
+        </w:tc>
+        <w:tc>
+          <w:tcPr/>
+          <w:p>
+            <w:pPr>
+              <w:pStyle w:val="Compact"/>
+              <w:jc w:val="left"/>
+            </w:pPr>
+            <w:r>
+              <w:t xml:space="preserve">数日〜数週 (テンプレ作成必要)</w:t>
+            </w:r>
+          </w:p>
+        </w:tc>
+        <w:tc>
+          <w:tcPr/>
+          <w:p>
+            <w:pPr>
+              <w:pStyle w:val="Compact"/>
+              <w:jc w:val="left"/>
+            </w:pPr>
+            <w:r>
+              <w:rPr>
+                <w:bCs/>
+                <w:b/>
+              </w:rPr>
+              <w:t xml:space="preserve">即日</w:t>
+            </w:r>
+            <w:r>
+              <w:t xml:space="preserve"> </w:t>
+            </w:r>
+            <w:r>
+              <w:t xml:space="preserve">(プロンプト調整のみ)</w:t>
+            </w:r>
+          </w:p>
+        </w:tc>
+      </w:tr>
+      <w:tr>
+        <w:tc>
+          <w:tcPr/>
+          <w:p>
+            <w:pPr>
+              <w:pStyle w:val="Compact"/>
+              <w:jc w:val="left"/>
+            </w:pPr>
+            <w:r>
+              <w:t xml:space="preserve">レイアウト崩れ耐性</w:t>
+            </w:r>
+          </w:p>
+        </w:tc>
+        <w:tc>
+          <w:tcPr/>
+          <w:p>
+            <w:pPr>
+              <w:pStyle w:val="Compact"/>
+              <w:jc w:val="left"/>
+            </w:pPr>
+            <w:r>
+              <w:t xml:space="preserve">弱い (罫線・列ズレで崩壊)</w:t>
+            </w:r>
+          </w:p>
+        </w:tc>
+        <w:tc>
+          <w:tcPr/>
+          <w:p>
+            <w:pPr>
+              <w:pStyle w:val="Compact"/>
+              <w:jc w:val="left"/>
+            </w:pPr>
+            <w:r>
+              <w:rPr>
+                <w:bCs/>
+                <w:b/>
+              </w:rPr>
+              <w:t xml:space="preserve">強い</w:t>
+            </w:r>
+            <w:r>
+              <w:t xml:space="preserve"> </w:t>
+            </w:r>
+            <w:r>
+              <w:t xml:space="preserve">(意味理解で吸収)</w:t>
+            </w:r>
+          </w:p>
+        </w:tc>
+      </w:tr>
+      <w:tr>
+        <w:tc>
+          <w:tcPr/>
+          <w:p>
+            <w:pPr>
+              <w:pStyle w:val="Compact"/>
+              <w:jc w:val="left"/>
+            </w:pPr>
+            <w:r>
+              <w:t xml:space="preserve">強調マーカーの解釈</w:t>
+            </w:r>
+          </w:p>
+        </w:tc>
+        <w:tc>
+          <w:tcPr/>
+          <w:p>
+            <w:pPr>
+              <w:pStyle w:val="Compact"/>
+              <w:jc w:val="left"/>
+            </w:pPr>
+            <w:r>
+              <w:t xml:space="preserve">不可</w:t>
+            </w:r>
+          </w:p>
+        </w:tc>
+        <w:tc>
+          <w:tcPr/>
+          <w:p>
+            <w:pPr>
+              <w:pStyle w:val="Compact"/>
+              <w:jc w:val="left"/>
+            </w:pPr>
+            <w:r>
+              <w:rPr>
+                <w:bCs/>
+                <w:b/>
+              </w:rPr>
+              <w:t xml:space="preserve">可能</w:t>
+            </w:r>
+            <w:r>
+              <w:t xml:space="preserve"> </w:t>
+            </w:r>
+            <w:r>
+              <w:t xml:space="preserve">(タグ自動付与)</w:t>
+            </w:r>
+          </w:p>
+        </w:tc>
+      </w:tr>
+      <w:tr>
+        <w:tc>
+          <w:tcPr/>
+          <w:p>
+            <w:pPr>
+              <w:pStyle w:val="Compact"/>
+              <w:jc w:val="left"/>
+            </w:pPr>
+            <w:r>
+              <w:t xml:space="preserve">誤読の自己申告</w:t>
+            </w:r>
+          </w:p>
+        </w:tc>
+        <w:tc>
+          <w:tcPr/>
+          <w:p>
+            <w:pPr>
+              <w:pStyle w:val="Compact"/>
+              <w:jc w:val="left"/>
+            </w:pPr>
+            <w:r>
+              <w:t xml:space="preserve">不可</w:t>
+            </w:r>
+          </w:p>
+        </w:tc>
+        <w:tc>
+          <w:tcPr/>
+          <w:p>
+            <w:pPr>
+              <w:pStyle w:val="Compact"/>
+              <w:jc w:val="left"/>
+            </w:pPr>
+            <w:r>
+              <w:rPr>
+                <w:bCs/>
+                <w:b/>
+              </w:rPr>
+              <w:t xml:space="preserve">可能</w:t>
+            </w:r>
+            <w:r>
+              <w:t xml:space="preserve"> </w:t>
+            </w:r>
+            <w:r>
+              <w:t xml:space="preserve">(要確認件数として列挙)</w:t>
+            </w:r>
+          </w:p>
+        </w:tc>
+      </w:tr>
+    </w:tbl>
+    <w:p>
+      <w:pPr>
+        <w:pStyle w:val="BodyText"/>
+      </w:pPr>
+      <w:r>
+        <w:t xml:space="preserve">この技術的優位こそが、</w:t>
+      </w:r>
+      <w:r>
+        <w:rPr>
+          <w:bCs/>
+          <w:b/>
+        </w:rPr>
+        <w:t xml:space="preserve">本補助事業が「単なる OCR 導入」ではなく「次世代健康データ取込基盤の構築」と評価されるべき所以</w:t>
+      </w:r>
+      <w:r>
+        <w:t xml:space="preserve"> </w:t>
+      </w:r>
+      <w:r>
+        <w:t xml:space="preserve">である。UNFIX 社はこのネイティブ・マルチモーダル AI スキャンを</w:t>
+      </w:r>
+      <w:r>
+        <w:rPr>
+          <w:bCs/>
+          <w:b/>
+        </w:rPr>
+        <w:t xml:space="preserve">既にパイロット段階で本番品質に到達させている</w:t>
+      </w:r>
+      <w:r>
+        <w:t xml:space="preserve">唯一の委託先であり、本補助事業の革新性を期間内に達成するには UNFIX 社への単独委託が技術的に必須である。</w:t>
+      </w:r>
+    </w:p>
+    <w:bookmarkEnd w:id="33"/>
+    <w:bookmarkEnd w:id="34"/>
+    <w:bookmarkStart w:id="38" w:name="X5bd4d41643c01517e69ffc2c6207178fc550e83"/>
+    <w:p>
+      <w:pPr>
+        <w:pStyle w:val="Heading3"/>
+      </w:pPr>
+      <w:r>
+        <w:t xml:space="preserve">5.3 ウェルフォート様での実証検証結果 (実証データ添付)</w:t>
+      </w:r>
+    </w:p>
+    <w:p>
+      <w:pPr>
+        <w:pStyle w:val="FirstParagraph"/>
+      </w:pPr>
+      <w:r>
+        <w:t xml:space="preserve">UNFIX 社のパイロット V1 を、当社 (Wellfort) 役員レビューにて検証した結果を以下に示す。</w:t>
+      </w:r>
+    </w:p>
+    <w:bookmarkStart w:id="35" w:name="検証材料"/>
+    <w:p>
+      <w:pPr>
+        <w:pStyle w:val="Heading4"/>
+      </w:pPr>
+      <w:r>
+        <w:t xml:space="preserve">検証材料</w:t>
+      </w:r>
+    </w:p>
+    <w:p>
+      <w:pPr>
+        <w:numPr>
+          <w:ilvl w:val="0"/>
+          <w:numId w:val="1004"/>
+        </w:numPr>
+        <w:pStyle w:val="Compact"/>
+      </w:pPr>
+      <w:r>
+        <w:rPr>
+          <w:bCs/>
+          <w:b/>
+        </w:rPr>
+        <w:t xml:space="preserve">検査票原本</w:t>
+      </w:r>
+      <w:r>
+        <w:t xml:space="preserve">: 獨協医科大学埼玉医療センター 臨床検査部 発行の血液・尿検査詳細情報 (84 歳患者・2023-07-26 採取)</w:t>
+      </w:r>
+    </w:p>
+    <w:p>
+      <w:pPr>
+        <w:numPr>
+          <w:ilvl w:val="0"/>
+          <w:numId w:val="1004"/>
+        </w:numPr>
+        <w:pStyle w:val="Compact"/>
+      </w:pPr>
+      <w:r>
         <w:t xml:space="preserve">紙面は</w:t>
       </w:r>
       <w:r>
@@ -2408,7 +3555,7 @@
       <w:pPr>
         <w:numPr>
           <w:ilvl w:val="0"/>
-          <w:numId w:val="1003"/>
+          <w:numId w:val="1004"/>
         </w:numPr>
         <w:pStyle w:val="Compact"/>
       </w:pPr>
@@ -2420,7 +3567,7 @@
       <w:pPr>
         <w:numPr>
           <w:ilvl w:val="0"/>
-          <w:numId w:val="1003"/>
+          <w:numId w:val="1004"/>
         </w:numPr>
         <w:pStyle w:val="Compact"/>
       </w:pPr>
@@ -2442,7 +3589,7 @@
       <w:pPr>
         <w:numPr>
           <w:ilvl w:val="0"/>
-          <w:numId w:val="1003"/>
+          <w:numId w:val="1004"/>
         </w:numPr>
         <w:pStyle w:val="Compact"/>
       </w:pPr>
@@ -2450,8 +3597,8 @@
         <w:t xml:space="preserve">患者氏名・ID 等の個人情報が含まれる</w:t>
       </w:r>
     </w:p>
-    <w:bookmarkEnd w:id="31"/>
-    <w:bookmarkStart w:id="32" w:name="検証結果-添付スクリーンショット①--②--③-参照"/>
+    <w:bookmarkEnd w:id="35"/>
+    <w:bookmarkStart w:id="36" w:name="検証結果-添付スクリーンショット①--②--③-参照"/>
     <w:p>
       <w:pPr>
         <w:pStyle w:val="Heading4"/>
@@ -2865,8 +4012,8 @@
         </w:tc>
       </w:tr>
     </w:tbl>
-    <w:bookmarkEnd w:id="32"/>
-    <w:bookmarkStart w:id="33" w:name="添付資料一覧-本書とともに事務局へ提出"/>
+    <w:bookmarkEnd w:id="36"/>
+    <w:bookmarkStart w:id="37" w:name="添付資料一覧-本書とともに事務局へ提出"/>
     <w:p>
       <w:pPr>
         <w:pStyle w:val="Heading4"/>
@@ -3032,15 +4179,15 @@
         </w:tc>
       </w:tr>
     </w:tbl>
-    <w:bookmarkEnd w:id="33"/>
-    <w:bookmarkEnd w:id="34"/>
-    <w:bookmarkStart w:id="35" w:name="X36d82262ed64c04519b8c19be2db7db6e0c9ca1"/>
+    <w:bookmarkEnd w:id="37"/>
+    <w:bookmarkEnd w:id="38"/>
+    <w:bookmarkStart w:id="39" w:name="X7a385e5bd7ed35556335c0a1b0b7df0aacbc642"/>
     <w:p>
       <w:pPr>
         <w:pStyle w:val="Heading3"/>
       </w:pPr>
       <w:r>
-        <w:t xml:space="preserve">5.3 実証結果が示す技術的合理性</w:t>
+        <w:t xml:space="preserve">5.4 実証結果が示す技術的合理性</w:t>
       </w:r>
     </w:p>
     <w:p>
@@ -3055,7 +4202,7 @@
       <w:pPr>
         <w:numPr>
           <w:ilvl w:val="0"/>
-          <w:numId w:val="1004"/>
+          <w:numId w:val="1005"/>
         </w:numPr>
         <w:pStyle w:val="Compact"/>
       </w:pPr>
@@ -3077,7 +4224,7 @@
       <w:pPr>
         <w:numPr>
           <w:ilvl w:val="0"/>
-          <w:numId w:val="1004"/>
+          <w:numId w:val="1005"/>
         </w:numPr>
         <w:pStyle w:val="Compact"/>
       </w:pPr>
@@ -3099,7 +4246,7 @@
       <w:pPr>
         <w:numPr>
           <w:ilvl w:val="0"/>
-          <w:numId w:val="1004"/>
+          <w:numId w:val="1005"/>
         </w:numPr>
         <w:pStyle w:val="Compact"/>
       </w:pPr>
@@ -3121,7 +4268,7 @@
       <w:pPr>
         <w:numPr>
           <w:ilvl w:val="0"/>
-          <w:numId w:val="1004"/>
+          <w:numId w:val="1005"/>
         </w:numPr>
         <w:pStyle w:val="Compact"/>
       </w:pPr>
@@ -3164,9 +4311,9 @@
         </w:pict>
       </w:r>
     </w:p>
-    <w:bookmarkEnd w:id="35"/>
-    <w:bookmarkEnd w:id="36"/>
-    <w:bookmarkStart w:id="39" w:name="第-6-章-選定理由⑤--単一委託による責任分界の最適化"/>
+    <w:bookmarkEnd w:id="39"/>
+    <w:bookmarkEnd w:id="40"/>
+    <w:bookmarkStart w:id="43" w:name="第-6-章-選定理由⑤--単一委託による責任分界の最適化"/>
     <w:p>
       <w:pPr>
         <w:pStyle w:val="Heading2"/>
@@ -3175,7 +4322,7 @@
         <w:t xml:space="preserve">第 6 章 選定理由⑤ — 単一委託による責任分界の最適化</w:t>
       </w:r>
     </w:p>
-    <w:bookmarkStart w:id="37" w:name="Xacfa7f99998ddf85b39785d1040a61765122cd5"/>
+    <w:bookmarkStart w:id="41" w:name="Xacfa7f99998ddf85b39785d1040a61765122cd5"/>
     <w:p>
       <w:pPr>
         <w:pStyle w:val="Heading3"/>
@@ -3414,8 +4561,8 @@
         </w:tc>
       </w:tr>
     </w:tbl>
-    <w:bookmarkEnd w:id="37"/>
-    <w:bookmarkStart w:id="38" w:name="X6ab8c1bc902aa0726ddad564d13f5cf7521f6f4"/>
+    <w:bookmarkEnd w:id="41"/>
+    <w:bookmarkStart w:id="42" w:name="X6ab8c1bc902aa0726ddad564d13f5cf7521f6f4"/>
     <w:p>
       <w:pPr>
         <w:pStyle w:val="Heading3"/>
@@ -3436,7 +4583,7 @@
       <w:pPr>
         <w:numPr>
           <w:ilvl w:val="0"/>
-          <w:numId w:val="1005"/>
+          <w:numId w:val="1006"/>
         </w:numPr>
         <w:pStyle w:val="Compact"/>
       </w:pPr>
@@ -3464,7 +4611,7 @@
       <w:pPr>
         <w:numPr>
           <w:ilvl w:val="0"/>
-          <w:numId w:val="1005"/>
+          <w:numId w:val="1006"/>
         </w:numPr>
         <w:pStyle w:val="Compact"/>
       </w:pPr>
@@ -3486,7 +4633,7 @@
       <w:pPr>
         <w:numPr>
           <w:ilvl w:val="0"/>
-          <w:numId w:val="1005"/>
+          <w:numId w:val="1006"/>
         </w:numPr>
         <w:pStyle w:val="Compact"/>
       </w:pPr>
@@ -3519,9 +4666,9 @@
         </w:pict>
       </w:r>
     </w:p>
-    <w:bookmarkEnd w:id="38"/>
-    <w:bookmarkEnd w:id="39"/>
-    <w:bookmarkStart w:id="41" w:name="第-7-章-まとめ--5-つの観点の総合判断"/>
+    <w:bookmarkEnd w:id="42"/>
+    <w:bookmarkEnd w:id="43"/>
+    <w:bookmarkStart w:id="45" w:name="第-7-章-まとめ--5-つの観点の総合判断"/>
     <w:p>
       <w:pPr>
         <w:pStyle w:val="Heading2"/>
@@ -3706,31 +4853,31 @@
               <w:jc w:val="left"/>
             </w:pPr>
             <w:r>
-              <w:t xml:space="preserve">④ パイロット V1 で実証された AI スキャン技術力</w:t>
-            </w:r>
-          </w:p>
-        </w:tc>
-        <w:tc>
-          <w:tcPr/>
-          <w:p>
-            <w:pPr>
-              <w:pStyle w:val="Compact"/>
-              <w:jc w:val="left"/>
-            </w:pPr>
-            <w:r>
-              <w:t xml:space="preserve">添付実証データの通り本番品質に到達</w:t>
-            </w:r>
-          </w:p>
-        </w:tc>
-        <w:tc>
-          <w:tcPr/>
-          <w:p>
-            <w:pPr>
-              <w:pStyle w:val="Compact"/>
-              <w:jc w:val="left"/>
-            </w:pPr>
-            <w:r>
-              <w:t xml:space="preserve">他社で同水準に到達不可能 → 補助事業の核心機能が動かない</w:t>
+              <w:t xml:space="preserve">④ ネイティブ・マルチモーダル AI による次世代スキャン (パイロット V1 実証済)</w:t>
+            </w:r>
+          </w:p>
+        </w:tc>
+        <w:tc>
+          <w:tcPr/>
+          <w:p>
+            <w:pPr>
+              <w:pStyle w:val="Compact"/>
+              <w:jc w:val="left"/>
+            </w:pPr>
+            <w:r>
+              <w:t xml:space="preserve">従来 OCR と次元の異なる認識力・理解力。手書き・文脈推論・強調マーカー解釈まで本番品質に到達</w:t>
+            </w:r>
+          </w:p>
+        </w:tc>
+        <w:tc>
+          <w:tcPr/>
+          <w:p>
+            <w:pPr>
+              <w:pStyle w:val="Compact"/>
+              <w:jc w:val="left"/>
+            </w:pPr>
+            <w:r>
+              <w:t xml:space="preserve">他社の OCR ベース実装では同水準に到達不可能 → 補助事業の核心機能が動かない</w:t>
             </w:r>
           </w:p>
         </w:tc>
@@ -3826,7 +4973,7 @@
         </w:pict>
       </w:r>
     </w:p>
-    <w:bookmarkStart w:id="40" w:name="添付資料"/>
+    <w:bookmarkStart w:id="44" w:name="添付資料"/>
     <w:p>
       <w:pPr>
         <w:pStyle w:val="Heading3"/>
@@ -3839,7 +4986,7 @@
       <w:pPr>
         <w:numPr>
           <w:ilvl w:val="0"/>
-          <w:numId w:val="1006"/>
+          <w:numId w:val="1007"/>
         </w:numPr>
         <w:pStyle w:val="Compact"/>
       </w:pPr>
@@ -3851,7 +4998,7 @@
       <w:pPr>
         <w:numPr>
           <w:ilvl w:val="0"/>
-          <w:numId w:val="1006"/>
+          <w:numId w:val="1007"/>
         </w:numPr>
         <w:pStyle w:val="Compact"/>
       </w:pPr>
@@ -3863,7 +5010,7 @@
       <w:pPr>
         <w:numPr>
           <w:ilvl w:val="0"/>
-          <w:numId w:val="1006"/>
+          <w:numId w:val="1007"/>
         </w:numPr>
         <w:pStyle w:val="Compact"/>
       </w:pPr>
@@ -3875,7 +5022,7 @@
       <w:pPr>
         <w:numPr>
           <w:ilvl w:val="0"/>
-          <w:numId w:val="1006"/>
+          <w:numId w:val="1007"/>
         </w:numPr>
         <w:pStyle w:val="Compact"/>
       </w:pPr>
@@ -3883,9 +5030,9 @@
         <w:t xml:space="preserve">AI スキャン結果 — #2 右側検査表 詳細展開 (24 項目構造化抽出)</w:t>
       </w:r>
     </w:p>
-    <w:bookmarkEnd w:id="40"/>
-    <w:bookmarkEnd w:id="41"/>
-    <w:bookmarkEnd w:id="42"/>
+    <w:bookmarkEnd w:id="44"/>
+    <w:bookmarkEnd w:id="45"/>
+    <w:bookmarkEnd w:id="46"/>
     <w:sectPr/>
   </w:body>
 </w:document>
@@ -4166,34 +5313,7 @@
     <w:abstractNumId w:val="991"/>
   </w:num>
   <w:num w:numId="1004">
-    <w:abstractNumId w:val="99411"/>
-    <w:lvlOverride w:ilvl="0">
-      <w:startOverride w:val="1"/>
-    </w:lvlOverride>
-    <w:lvlOverride w:ilvl="1">
-      <w:startOverride w:val="1"/>
-    </w:lvlOverride>
-    <w:lvlOverride w:ilvl="2">
-      <w:startOverride w:val="1"/>
-    </w:lvlOverride>
-    <w:lvlOverride w:ilvl="3">
-      <w:startOverride w:val="1"/>
-    </w:lvlOverride>
-    <w:lvlOverride w:ilvl="4">
-      <w:startOverride w:val="1"/>
-    </w:lvlOverride>
-    <w:lvlOverride w:ilvl="5">
-      <w:startOverride w:val="1"/>
-    </w:lvlOverride>
-    <w:lvlOverride w:ilvl="6">
-      <w:startOverride w:val="1"/>
-    </w:lvlOverride>
-    <w:lvlOverride w:ilvl="7">
-      <w:startOverride w:val="1"/>
-    </w:lvlOverride>
-    <w:lvlOverride w:ilvl="8">
-      <w:startOverride w:val="1"/>
-    </w:lvlOverride>
+    <w:abstractNumId w:val="991"/>
   </w:num>
   <w:num w:numId="1005">
     <w:abstractNumId w:val="99411"/>
@@ -4226,6 +5346,36 @@
     </w:lvlOverride>
   </w:num>
   <w:num w:numId="1006">
+    <w:abstractNumId w:val="99411"/>
+    <w:lvlOverride w:ilvl="0">
+      <w:startOverride w:val="1"/>
+    </w:lvlOverride>
+    <w:lvlOverride w:ilvl="1">
+      <w:startOverride w:val="1"/>
+    </w:lvlOverride>
+    <w:lvlOverride w:ilvl="2">
+      <w:startOverride w:val="1"/>
+    </w:lvlOverride>
+    <w:lvlOverride w:ilvl="3">
+      <w:startOverride w:val="1"/>
+    </w:lvlOverride>
+    <w:lvlOverride w:ilvl="4">
+      <w:startOverride w:val="1"/>
+    </w:lvlOverride>
+    <w:lvlOverride w:ilvl="5">
+      <w:startOverride w:val="1"/>
+    </w:lvlOverride>
+    <w:lvlOverride w:ilvl="6">
+      <w:startOverride w:val="1"/>
+    </w:lvlOverride>
+    <w:lvlOverride w:ilvl="7">
+      <w:startOverride w:val="1"/>
+    </w:lvlOverride>
+    <w:lvlOverride w:ilvl="8">
+      <w:startOverride w:val="1"/>
+    </w:lvlOverride>
+  </w:num>
+  <w:num w:numId="1007">
     <w:abstractNumId w:val="99411"/>
     <w:lvlOverride w:ilvl="0">
       <w:startOverride w:val="1"/>

</xml_diff>